<commit_message>
added partially observed and added state supervision to original experiment
</commit_message>
<xml_diff>
--- a/Presentation_slides.docx
+++ b/Presentation_slides.docx
@@ -89,7 +89,7 @@
     </w:p>
     <w:p>
       <w:r>
-        <w:t>The model is trained from a dataset of successful trajectories rather than by trial and error inside the maze. Each trajectory is a sequence of maze positions together with the moves that connect them. So the model learns by imitating examples of good behaviour that are already known to solve the planning task. This keeps the training problem closely tied to the valid solutions already available in the dataset.</w:t>
+        <w:t xml:space="preserve">The model is trained from a dataset of successful trajectories rather than by trial and error inside the maze. Each trajectory is a sequence of maze positions together with the moves that connect them. So the model learns by imitating examples of good behaviour that are already known to solve the planning task. </w:t>
       </w:r>
     </w:p>
     <w:p>
@@ -105,7 +105,7 @@
     </w:p>
     <w:p>
       <w:r>
-        <w:t>The model class used here is a generative model. Broadly, this means a model that learns a probability distribution from data. In this project, the data are valid maze trajectories. So after training, the model assigns probabilities to possible next moves, where a higher probability means that the move is judged to be more consistent with the successful trajectories in the training data. Those probabilities are then used by the decoding algorithm to decide how to continue the path.</w:t>
+        <w:t xml:space="preserve">The model class used here is a generative model. Broadly, this means a model that learns a probability distribution from data. In this project, the data are valid maze trajectories. So after training, the model assigns probabilities to possible next moves, where a higher probability means that the move is judged to be more consistent with the successful trajectories in the training data. </w:t>
       </w:r>
     </w:p>
     <w:p>
@@ -127,7 +127,13 @@
         <w:t>series of actions</w:t>
       </w:r>
       <w:r>
-        <w:t xml:space="preserve"> generated so far, and then produces probabilities for the possible next moves. After one move is chosen, the position updates, and the process repeats until the goal is reached or a step limit is exceeded. That is what autoregressive sequence modelling means in this project: the path is built one step at a time, always using what has already been generated.</w:t>
+        <w:t xml:space="preserve"> generated so far, and then produces probabilities for the possible next moves. After one move is chosen, the position updates, and the process repeats until the goal is reached or a step limit is exceeded. That is what autoregressive sequence modelling means in this project: the </w:t>
+      </w:r>
+      <w:r>
+        <w:t>trajectory</w:t>
+      </w:r>
+      <w:r>
+        <w:t xml:space="preserve"> is built one step at a time, always using what has already been generated.</w:t>
       </w:r>
     </w:p>
     <w:p>
@@ -167,26 +173,26 @@
     </w:p>
     <w:p>
       <w:r>
+        <w:t>Slide 1</w:t>
+      </w:r>
+      <w:r>
+        <w:t>0</w:t>
+      </w:r>
+      <w:r>
+        <w:t xml:space="preserve"> beam search:</w:t>
+      </w:r>
+    </w:p>
+    <w:p>
+      <w:r>
         <w:lastRenderedPageBreak/>
+        <w:t>Beam search is similar to greedy decoding, but instead of following only one possible path, it keeps several of the most promising paths at the same time. For example, if the beam width is 2, then after the first decision it keeps the two most likely first moves. It then extends both of those by one more move, compares the resulting options, and again keeps only the best two paths. This repeats at every step. Beam search with width 3 works in the same way, except that it keeps the best three paths at each stage instead of two. Because it considers more than one possible route at a time, beam search can often find better solutions than greedy decoding, although it usually requires more computation.</w:t>
+      </w:r>
+    </w:p>
+    <w:p>
+      <w:r>
         <w:t>Slide 1</w:t>
       </w:r>
       <w:r>
-        <w:t>0</w:t>
-      </w:r>
-      <w:r>
-        <w:t xml:space="preserve"> beam search:</w:t>
-      </w:r>
-    </w:p>
-    <w:p>
-      <w:r>
-        <w:t>Beam search is similar to greedy decoding, but instead of following only one possible path, it keeps several of the most promising paths at the same time. For example, if the beam width is 2, then after the first decision it keeps the two most likely first moves. It then extends both of those by one more move, compares the resulting options, and again keeps only the best two paths. This repeats at every step. Beam search with width 3 works in the same way, except that it keeps the best three paths at each stage instead of two. Because it considers more than one possible route at a time, beam search can often find better solutions than greedy decoding, although it usually requires more computation.</w:t>
-      </w:r>
-    </w:p>
-    <w:p>
-      <w:r>
-        <w:t>Slide 1</w:t>
-      </w:r>
-      <w:r>
         <w:t>1</w:t>
       </w:r>
       <w:r>
@@ -195,7 +201,13 @@
     </w:p>
     <w:p>
       <w:r>
-        <w:t>To compare these decoding strategies, I used four metrics. The first is completion rate: the proportion of planning queries for which the generated trajectory actually reaches the goal. The second is average steps to goal, computed over successful trajectories only. This measures path efficiency. I also measured average compute time per query and average compute time per step, because beam search is expected to be more computationally expensive than greedy decoding.</w:t>
+        <w:t xml:space="preserve">To compare these decoding strategies, I used four metrics. The first is completion rate: the proportion of planning queries for which the generated trajectory actually reaches the goal. The second is average steps to goal, computed over successful trajectories only. This measures path efficiency. I also measured average compute time per </w:t>
+      </w:r>
+      <w:r>
+        <w:t xml:space="preserve">trajectory </w:t>
+      </w:r>
+      <w:r>
+        <w:t>and average compute time per step, because beam search is expected to be more computationally expensive than greedy decoding.</w:t>
       </w:r>
     </w:p>
     <w:p>
@@ -1103,6 +1115,7 @@
   <w:style w:type="character" w:default="1" w:styleId="DefaultParagraphFont">
     <w:name w:val="Default Paragraph Font"/>
     <w:uiPriority w:val="1"/>
+    <w:semiHidden/>
     <w:unhideWhenUsed/>
   </w:style>
   <w:style w:type="table" w:default="1" w:styleId="TableNormal">

</xml_diff>